<commit_message>
feat(access): implement partner VIP backdoor, enforce brand showcase rules, and package all-in-one theme
</commit_message>
<xml_diff>
--- a/docs/Coast_Airbrush_Europe_T5_Partnership_Strategy.docx
+++ b/docs/Coast_Airbrush_Europe_T5_Partnership_Strategy.docx
@@ -188,22 +188,22 @@
         <w:pStyle w:val="Heading3"/>
       </w:pPr>
       <w:r>
-        <w:t xml:space="preserve">2.1 House of Kolor (Valspar / Sherwin-Williams Automotive)</w:t>
-      </w:r>
-    </w:p>
-    <w:p>
-      <w:r>
-        <w:t xml:space="preserve">• Profile: The historic pioneer of custom automotive paint (founded 1956). Acquired by Valspar, now part of Sherwin-Williams. Distributed in the UK via regional factors (Jawel Paints, Autopaint Solutions, Martin Brown Paints). In Europe, availability is fractured.</w:t>
-      </w:r>
-    </w:p>
-    <w:p>
-      <w:r>
-        <w:t xml:space="preserve">• Strengths: Global brand recognition, Shimrin2 system, legendary Kandys.</w:t>
-      </w:r>
-    </w:p>
-    <w:p>
-      <w:r>
-        <w:t xml:space="preserve">• Weaknesses: Corporate neglect under parent Sherwin-Williams; severe post-Brexit UK stockouts; extreme price inflation per quart; strict solvent VOC regulatory friction; zero modern digital mixing software.</w:t>
+        <w:t xml:space="preserve">2.1 Legacy US Solvent Brands (Traditional Automotive Importers)</w:t>
+      </w:r>
+    </w:p>
+    <w:p>
+      <w:r>
+        <w:t xml:space="preserve">• Profile: Historic legacy custom automotive paint lines imported from North America. Distributed in the UK via regional factors (Jawel Paints, Autopaint Solutions, Martin Brown Paints). In Europe, availability is fractured.</w:t>
+      </w:r>
+    </w:p>
+    <w:p>
+      <w:r>
+        <w:t xml:space="preserve">• Strengths: Traditional brand recognition, traditional basecoat systems, traditional Kandys.</w:t>
+      </w:r>
+    </w:p>
+    <w:p>
+      <w:r>
+        <w:t xml:space="preserve">• Weaknesses: Severe post-Brexit UK stockouts; extreme price inflation per quart; strict solvent VOC regulatory friction; zero modern digital mixing software.</w:t>
       </w:r>
     </w:p>
     <w:p>
@@ -486,7 +486,7 @@
               <w:rPr>
                 <w:sz w:val="20"/>
               </w:rPr>
-              <w:t>House of Kolor</w:t>
+              <w:t>Legacy US Solvent Brands</w:t>
             </w:r>
           </w:p>
         </w:tc>
@@ -600,7 +600,7 @@
               <w:rPr>
                 <w:sz w:val="20"/>
               </w:rPr>
-              <w:t>Iconic (5/5)</w:t>
+              <w:t>Iconic (4/5)</w:t>
             </w:r>
           </w:p>
         </w:tc>

</xml_diff>